<commit_message>
docs: atualiza relatorio com versao correta do Flutter e status do CI
- Corrige versao do Flutter de 3.22.0 para 3.41.6 na secao 5.3
- Atualiza tempo de execucao dos testes de ~4s para ~12s (local)
- Adiciona confirmacao de que o pipeline CI/CD esta operacional
  e com todos os jobs aprovados (status verde no GitHub Actions)
- Atualiza metrica do pipeline para ~7 min (execucao completa no CI)
</commit_message>
<xml_diff>
--- a/Relatorio_Final_A3_EvoluaPRO.docx
+++ b/Relatorio_Final_A3_EvoluaPRO.docx
@@ -2755,7 +2755,7 @@
           <w:sz w:val="24"/>
           <w:szCs w:val="24"/>
         </w:rPr>
-        <w:t xml:space="preserve">(2) Configuracao do ambiente Flutter 3.22.0 (canal stable) com cache habilitado</w:t>
+        <w:t xml:space="preserve">(2) Configuracao do ambiente Flutter 3.41.6 (canal stable) com cache habilitado</w:t>
       </w:r>
     </w:p>
     <w:p>
@@ -2869,7 +2869,31 @@
           <w:sz w:val="24"/>
           <w:szCs w:val="24"/>
         </w:rPr>
-        <w:t xml:space="preserve">(8) Publicacao do relatorio LCOV no Codecov</w:t>
+        <w:t xml:space="preserve">(8) Publicacao do relatorio LCOV no Codecov
+Status atual do pipeline: Operacional e aprovado (todos os jobs com status verde no GitHub Actions).</w:t>
+      </w:r>
+    </w:p>
+    <w:p>
+      <w:pPr>
+        <w:spacing w:after="120" w:before="120"/>
+      </w:pPr>
+      <w:r>
+        <w:rPr>
+          <w:rFonts w:ascii="Arial" w:hAnsi="Arial" w:cs="Arial"/>
+          <w:b/>
+          <w:sz w:val="22"/>
+          <w:szCs w:val="22"/>
+        </w:rPr>
+        <w:t xml:space="preserve">Status do pipeline CI/CD: </w:t>
+      </w:r>
+      <w:r>
+        <w:rPr>
+          <w:rFonts w:ascii="Arial" w:hAnsi="Arial" w:cs="Arial"/>
+          <w:color w:val="375623"/>
+          <w:sz w:val="22"/>
+          <w:szCs w:val="22"/>
+        </w:rPr>
+        <w:t xml:space="preserve">Operacional e aprovado. Todos os jobs exibem status verde no GitHub Actions (https://github.com/isxb/Gestao-e-Qualidade-de-Software-A3/actions).</w:t>
       </w:r>
     </w:p>
     <w:p>
@@ -6487,7 +6511,7 @@
                 <w:sz w:val="22"/>
                 <w:szCs w:val="22"/>
               </w:rPr>
-              <w:t xml:space="preserve">~4 segundos</w:t>
+              <w:t xml:space="preserve">~12 segundos (local) / ~7 min (pipeline completo)</w:t>
             </w:r>
           </w:p>
         </w:tc>

</xml_diff>